<commit_message>
lab doc source update
</commit_message>
<xml_diff>
--- a/RVfpga/RVfpgaEL2/RVfpga_NexysVideo-NoDDR/Labs/Lab01/RVfpga_Lab01_VeeR-EL2_NexysVideo-NoDDR.docx
+++ b/RVfpga/RVfpgaEL2/RVfpga_NexysVideo-NoDDR/Labs/Lab01/RVfpga_Lab01_VeeR-EL2_NexysVideo-NoDDR.docx
@@ -604,18 +604,30 @@
         <w:rPr>
           <w:rFonts w:cs="Arial"/>
         </w:rPr>
-        <w:t>Nexys Video</w:t>
+        <w:t xml:space="preserve">Nexys </w:t>
       </w:r>
       <w:r>
         <w:rPr>
           <w:rFonts w:cs="Arial"/>
         </w:rPr>
-        <w:t xml:space="preserve"> Video</w:t>
+        <w:t>Video</w:t>
       </w:r>
       <w:r>
         <w:rPr>
           <w:rFonts w:cs="Arial"/>
         </w:rPr>
+        <w:t xml:space="preserve"> </w:t>
+      </w:r>
+      <w:r>
+        <w:rPr>
+          <w:rFonts w:cs="Arial"/>
+        </w:rPr>
+        <w:t>Video</w:t>
+      </w:r>
+      <w:r>
+        <w:rPr>
+          <w:rFonts w:cs="Arial"/>
+        </w:rPr>
         <w:t>-DDR</w:t>
       </w:r>
       <w:r>
@@ -642,7 +654,7 @@
           <w:iCs/>
           <w:color w:val="000000" w:themeColor="text1"/>
         </w:rPr>
-        <w:t>Nexys Video</w:t>
+        <w:t xml:space="preserve">Nexys </w:t>
       </w:r>
       <w:r>
         <w:rPr>
@@ -652,7 +664,17 @@
           <w:iCs/>
           <w:color w:val="000000" w:themeColor="text1"/>
         </w:rPr>
-        <w:t>VideoNoDDRPath</w:t>
+        <w:t>Video</w:t>
+      </w:r>
+      <w:r>
+        <w:rPr>
+          <w:rStyle w:val="findhit"/>
+          <w:rFonts w:eastAsia="Arial" w:cs="Arial"/>
+          <w:i/>
+          <w:iCs/>
+          <w:color w:val="000000" w:themeColor="text1"/>
+        </w:rPr>
+        <w:t>NoDDRPath</w:t>
       </w:r>
       <w:r>
         <w:rPr>
@@ -678,7 +700,7 @@
           <w:iCs/>
           <w:color w:val="000000" w:themeColor="text1"/>
         </w:rPr>
-        <w:t>Nexys Video</w:t>
+        <w:t xml:space="preserve">Nexys </w:t>
       </w:r>
       <w:r>
         <w:rPr>
@@ -688,7 +710,17 @@
           <w:iCs/>
           <w:color w:val="000000" w:themeColor="text1"/>
         </w:rPr>
-        <w:t>VideoNoDDRPath</w:t>
+        <w:t>Video</w:t>
+      </w:r>
+      <w:r>
+        <w:rPr>
+          <w:rStyle w:val="findhit"/>
+          <w:rFonts w:eastAsia="Arial" w:cs="Arial"/>
+          <w:i/>
+          <w:iCs/>
+          <w:color w:val="000000" w:themeColor="text1"/>
+        </w:rPr>
+        <w:t>NoDDRPath</w:t>
       </w:r>
       <w:r>
         <w:rPr>
@@ -714,7 +746,7 @@
           <w:iCs/>
           <w:color w:val="000000" w:themeColor="text1"/>
         </w:rPr>
-        <w:t>Nexys Video</w:t>
+        <w:t xml:space="preserve">Nexys </w:t>
       </w:r>
       <w:r>
         <w:rPr>
@@ -724,7 +756,17 @@
           <w:iCs/>
           <w:color w:val="000000" w:themeColor="text1"/>
         </w:rPr>
-        <w:t>VideoNoDDRPath</w:t>
+        <w:t>Video</w:t>
+      </w:r>
+      <w:r>
+        <w:rPr>
+          <w:rStyle w:val="findhit"/>
+          <w:rFonts w:eastAsia="Arial" w:cs="Arial"/>
+          <w:i/>
+          <w:iCs/>
+          <w:color w:val="000000" w:themeColor="text1"/>
+        </w:rPr>
+        <w:t>NoDDRPath</w:t>
       </w:r>
       <w:r>
         <w:rPr>
@@ -807,13 +849,25 @@
         <w:rPr>
           <w:b w:val="0"/>
         </w:rPr>
-        <w:t>Nexys Video</w:t>
-      </w:r>
-      <w:r>
-        <w:rPr>
-          <w:b w:val="0"/>
-        </w:rPr>
-        <w:t xml:space="preserve"> Video</w:t>
+        <w:t xml:space="preserve">Nexys </w:t>
+      </w:r>
+      <w:r>
+        <w:rPr>
+          <w:b w:val="0"/>
+        </w:rPr>
+        <w:t>Video</w:t>
+      </w:r>
+      <w:r>
+        <w:rPr>
+          <w:b w:val="0"/>
+        </w:rPr>
+        <w:t xml:space="preserve"> </w:t>
+      </w:r>
+      <w:r>
+        <w:rPr>
+          <w:b w:val="0"/>
+        </w:rPr>
+        <w:t>Video</w:t>
       </w:r>
       <w:r>
         <w:rPr>
@@ -955,13 +1009,25 @@
         <w:rPr>
           <w:b w:val="0"/>
         </w:rPr>
-        <w:t>Nexys Video</w:t>
-      </w:r>
-      <w:r>
-        <w:rPr>
-          <w:b w:val="0"/>
-        </w:rPr>
-        <w:t xml:space="preserve"> Video</w:t>
+        <w:t xml:space="preserve">Nexys </w:t>
+      </w:r>
+      <w:r>
+        <w:rPr>
+          <w:b w:val="0"/>
+        </w:rPr>
+        <w:t>Video</w:t>
+      </w:r>
+      <w:r>
+        <w:rPr>
+          <w:b w:val="0"/>
+        </w:rPr>
+        <w:t xml:space="preserve"> </w:t>
+      </w:r>
+      <w:r>
+        <w:rPr>
+          <w:b w:val="0"/>
+        </w:rPr>
+        <w:t>Video</w:t>
       </w:r>
       <w:r>
         <w:rPr>
@@ -979,13 +1045,25 @@
         <w:rPr>
           <w:b w:val="0"/>
         </w:rPr>
-        <w:t>Nexys Video</w:t>
-      </w:r>
-      <w:r>
-        <w:rPr>
-          <w:b w:val="0"/>
-        </w:rPr>
-        <w:t xml:space="preserve"> Video</w:t>
+        <w:t xml:space="preserve">Nexys </w:t>
+      </w:r>
+      <w:r>
+        <w:rPr>
+          <w:b w:val="0"/>
+        </w:rPr>
+        <w:t>Video</w:t>
+      </w:r>
+      <w:r>
+        <w:rPr>
+          <w:b w:val="0"/>
+        </w:rPr>
+        <w:t xml:space="preserve"> </w:t>
+      </w:r>
+      <w:r>
+        <w:rPr>
+          <w:b w:val="0"/>
+        </w:rPr>
+        <w:t>Video</w:t>
       </w:r>
       <w:r>
         <w:rPr>
@@ -1033,13 +1111,25 @@
         <w:rPr>
           <w:b w:val="0"/>
         </w:rPr>
-        <w:t>Nexys Video</w:t>
-      </w:r>
-      <w:r>
-        <w:rPr>
-          <w:b w:val="0"/>
-        </w:rPr>
-        <w:t xml:space="preserve"> Video</w:t>
+        <w:t xml:space="preserve">Nexys </w:t>
+      </w:r>
+      <w:r>
+        <w:rPr>
+          <w:b w:val="0"/>
+        </w:rPr>
+        <w:t>Video</w:t>
+      </w:r>
+      <w:r>
+        <w:rPr>
+          <w:b w:val="0"/>
+        </w:rPr>
+        <w:t xml:space="preserve"> </w:t>
+      </w:r>
+      <w:r>
+        <w:rPr>
+          <w:b w:val="0"/>
+        </w:rPr>
+        <w:t>Video</w:t>
       </w:r>
       <w:r>
         <w:rPr>
@@ -1213,7 +1303,7 @@
           <w:i/>
           <w:iCs/>
         </w:rPr>
-        <w:t>Nexys Video</w:t>
+        <w:t xml:space="preserve">Nexys </w:t>
       </w:r>
       <w:r>
         <w:rPr>
@@ -1221,7 +1311,15 @@
           <w:i/>
           <w:iCs/>
         </w:rPr>
-        <w:t>VideoNoDDRPath</w:t>
+        <w:t>Video</w:t>
+      </w:r>
+      <w:r>
+        <w:rPr>
+          <w:rFonts w:eastAsia="Arial" w:cs="Arial"/>
+          <w:i/>
+          <w:iCs/>
+        </w:rPr>
+        <w:t>NoDDRPath</w:t>
       </w:r>
       <w:r>
         <w:rPr>
@@ -1337,7 +1435,7 @@
           <w:i/>
           <w:iCs/>
         </w:rPr>
-        <w:t>Nexys Video</w:t>
+        <w:t xml:space="preserve">Nexys </w:t>
       </w:r>
       <w:r>
         <w:rPr>
@@ -1345,7 +1443,15 @@
           <w:i/>
           <w:iCs/>
         </w:rPr>
-        <w:t>VideoNoDDRPath</w:t>
+        <w:t>Video</w:t>
+      </w:r>
+      <w:r>
+        <w:rPr>
+          <w:rFonts w:eastAsia="Arial" w:cs="Arial"/>
+          <w:i/>
+          <w:iCs/>
+        </w:rPr>
+        <w:t>NoDDRPath</w:t>
       </w:r>
       <w:r>
         <w:rPr>
@@ -1528,7 +1634,6 @@
         </w:numPr>
       </w:pPr>
       <w:r>
-        <w:lastRenderedPageBreak/>
         <w:t xml:space="preserve">It then assigns a </w:t>
       </w:r>
       <w:r>
@@ -1567,6 +1672,7 @@
         <w:rPr>
           <w:rFonts w:ascii="Courier New" w:eastAsia="Courier New" w:hAnsi="Courier New" w:cs="Courier New"/>
         </w:rPr>
+        <w:lastRenderedPageBreak/>
         <w:t>set(TARGET_NAME Test.elf)</w:t>
       </w:r>
     </w:p>
@@ -1646,7 +1752,7 @@
           <w:i/>
           <w:iCs/>
         </w:rPr>
-        <w:t>Nexys Video</w:t>
+        <w:t xml:space="preserve">Nexys </w:t>
       </w:r>
       <w:r>
         <w:rPr>
@@ -1654,7 +1760,15 @@
           <w:i/>
           <w:iCs/>
         </w:rPr>
-        <w:t>VideoNoDDRPath</w:t>
+        <w:t>Video</w:t>
+      </w:r>
+      <w:r>
+        <w:rPr>
+          <w:rFonts w:eastAsia="Arial" w:cs="Arial"/>
+          <w:i/>
+          <w:iCs/>
+        </w:rPr>
+        <w:t>NoDDRPath</w:t>
       </w:r>
       <w:r>
         <w:rPr>
@@ -1742,7 +1856,7 @@
           <w:i/>
           <w:iCs/>
         </w:rPr>
-        <w:t>Nexys Video</w:t>
+        <w:t xml:space="preserve">Nexys </w:t>
       </w:r>
       <w:r>
         <w:rPr>
@@ -1750,7 +1864,7 @@
           <w:i/>
           <w:iCs/>
         </w:rPr>
-        <w:t>VideoNoDDRPath</w:t>
+        <w:t>Video</w:t>
       </w:r>
       <w:r>
         <w:rPr>
@@ -1758,6 +1872,14 @@
           <w:i/>
           <w:iCs/>
         </w:rPr>
+        <w:t>NoDDRPath</w:t>
+      </w:r>
+      <w:r>
+        <w:rPr>
+          <w:rFonts w:eastAsia="Arial" w:cs="Arial"/>
+          <w:i/>
+          <w:iCs/>
+        </w:rPr>
         <w:t>]/common</w:t>
       </w:r>
       <w:r>
@@ -1806,7 +1928,7 @@
           <w:i/>
           <w:iCs/>
         </w:rPr>
-        <w:t>Nexys Video</w:t>
+        <w:t xml:space="preserve">Nexys </w:t>
       </w:r>
       <w:r>
         <w:rPr>
@@ -1814,7 +1936,7 @@
           <w:i/>
           <w:iCs/>
         </w:rPr>
-        <w:t>VideoNoDDRPath</w:t>
+        <w:t>Video</w:t>
       </w:r>
       <w:r>
         <w:rPr>
@@ -1822,6 +1944,14 @@
           <w:i/>
           <w:iCs/>
         </w:rPr>
+        <w:t>NoDDRPath</w:t>
+      </w:r>
+      <w:r>
+        <w:rPr>
+          <w:rFonts w:eastAsia="Arial" w:cs="Arial"/>
+          <w:i/>
+          <w:iCs/>
+        </w:rPr>
         <w:t>]/</w:t>
       </w:r>
       <w:r>
@@ -1931,7 +2061,7 @@
           <w:i/>
           <w:iCs/>
         </w:rPr>
-        <w:t>Nexys Video</w:t>
+        <w:t xml:space="preserve">Nexys </w:t>
       </w:r>
       <w:r>
         <w:rPr>
@@ -1939,7 +2069,15 @@
           <w:i/>
           <w:iCs/>
         </w:rPr>
-        <w:t>VideoNoDDRPath</w:t>
+        <w:t>Video</w:t>
+      </w:r>
+      <w:r>
+        <w:rPr>
+          <w:rFonts w:eastAsia="Arial" w:cs="Arial"/>
+          <w:i/>
+          <w:iCs/>
+        </w:rPr>
+        <w:t>NoDDRPath</w:t>
       </w:r>
       <w:r>
         <w:rPr>
@@ -2042,7 +2180,7 @@
           <w:i/>
           <w:iCs/>
         </w:rPr>
-        <w:t>Nexys Video</w:t>
+        <w:t xml:space="preserve">Nexys </w:t>
       </w:r>
       <w:r>
         <w:rPr>
@@ -2050,7 +2188,15 @@
           <w:i/>
           <w:iCs/>
         </w:rPr>
-        <w:t>VideoNoDDRPath</w:t>
+        <w:t>Video</w:t>
+      </w:r>
+      <w:r>
+        <w:rPr>
+          <w:rFonts w:eastAsia="Arial" w:cs="Arial"/>
+          <w:i/>
+          <w:iCs/>
+        </w:rPr>
+        <w:t>NoDDRPath</w:t>
       </w:r>
       <w:r>
         <w:rPr>
@@ -2228,7 +2374,7 @@
           <w:lang w:val="es-ES" w:eastAsia="es-ES"/>
         </w:rPr>
         <w:drawing>
-          <wp:inline distT="0" distB="0" distL="0" distR="0" wp14:anchorId="71B6E813" wp14:editId="24098E11">
+          <wp:inline distT="0" distB="0" distL="0" distR="0" wp14:anchorId="71B6E813" wp14:editId="35EC8F5C">
             <wp:extent cx="5452685" cy="2068573"/>
             <wp:effectExtent l="0" t="0" r="0" b="0"/>
             <wp:docPr id="1216422317" name="Picture 1216422317"/>
@@ -2352,7 +2498,7 @@
           <w:b w:val="0"/>
           <w:i/>
         </w:rPr>
-        <w:t>Nexys Video</w:t>
+        <w:t xml:space="preserve">Nexys </w:t>
       </w:r>
       <w:r>
         <w:rPr>
@@ -2360,7 +2506,15 @@
           <w:b w:val="0"/>
           <w:i/>
         </w:rPr>
-        <w:t>VideoNoDDRPath</w:t>
+        <w:t>Video</w:t>
+      </w:r>
+      <w:r>
+        <w:rPr>
+          <w:rFonts w:eastAsia="Arial" w:cs="Arial"/>
+          <w:b w:val="0"/>
+          <w:i/>
+        </w:rPr>
+        <w:t>NoDDRPath</w:t>
       </w:r>
       <w:r>
         <w:rPr>
@@ -2423,7 +2577,6 @@
         <w:rPr>
           <w:b w:val="0"/>
         </w:rPr>
-        <w:lastRenderedPageBreak/>
         <w:t>Then, c</w:t>
       </w:r>
       <w:r>
@@ -3841,7 +3994,7 @@
           <w:b w:val="0"/>
           <w:i/>
         </w:rPr>
-        <w:t>Nexys Video</w:t>
+        <w:t xml:space="preserve">Nexys </w:t>
       </w:r>
       <w:r>
         <w:rPr>
@@ -3849,7 +4002,15 @@
           <w:b w:val="0"/>
           <w:i/>
         </w:rPr>
-        <w:t>VideoNoDDRPath</w:t>
+        <w:t>Video</w:t>
+      </w:r>
+      <w:r>
+        <w:rPr>
+          <w:rFonts w:ascii="Courier New" w:hAnsi="Courier New" w:cs="Courier New"/>
+          <w:b w:val="0"/>
+          <w:i/>
+        </w:rPr>
+        <w:t>NoDDRPath</w:t>
       </w:r>
       <w:r>
         <w:rPr>
@@ -4289,13 +4450,25 @@
         <w:rPr>
           <w:b w:val="0"/>
         </w:rPr>
-        <w:t>Nexys Video</w:t>
-      </w:r>
-      <w:r>
-        <w:rPr>
-          <w:b w:val="0"/>
-        </w:rPr>
-        <w:t xml:space="preserve"> Video</w:t>
+        <w:t xml:space="preserve">Nexys </w:t>
+      </w:r>
+      <w:r>
+        <w:rPr>
+          <w:b w:val="0"/>
+        </w:rPr>
+        <w:t>Video</w:t>
+      </w:r>
+      <w:r>
+        <w:rPr>
+          <w:b w:val="0"/>
+        </w:rPr>
+        <w:t xml:space="preserve"> </w:t>
+      </w:r>
+      <w:r>
+        <w:rPr>
+          <w:b w:val="0"/>
+        </w:rPr>
+        <w:t>Video</w:t>
       </w:r>
       <w:r>
         <w:rPr>
@@ -4525,13 +4698,25 @@
         <w:rPr>
           <w:b w:val="0"/>
         </w:rPr>
-        <w:t>Nexys Video</w:t>
-      </w:r>
-      <w:r>
-        <w:rPr>
-          <w:b w:val="0"/>
-        </w:rPr>
-        <w:t xml:space="preserve"> Video</w:t>
+        <w:t xml:space="preserve">Nexys </w:t>
+      </w:r>
+      <w:r>
+        <w:rPr>
+          <w:b w:val="0"/>
+        </w:rPr>
+        <w:t>Video</w:t>
+      </w:r>
+      <w:r>
+        <w:rPr>
+          <w:b w:val="0"/>
+        </w:rPr>
+        <w:t xml:space="preserve"> </w:t>
+      </w:r>
+      <w:r>
+        <w:rPr>
+          <w:b w:val="0"/>
+        </w:rPr>
+        <w:t>Video</w:t>
       </w:r>
       <w:r>
         <w:rPr>
@@ -4561,13 +4746,25 @@
         <w:rPr>
           <w:b w:val="0"/>
         </w:rPr>
-        <w:t>Nexys Video</w:t>
-      </w:r>
-      <w:r>
-        <w:rPr>
-          <w:b w:val="0"/>
-        </w:rPr>
-        <w:t xml:space="preserve"> Video</w:t>
+        <w:t xml:space="preserve">Nexys </w:t>
+      </w:r>
+      <w:r>
+        <w:rPr>
+          <w:b w:val="0"/>
+        </w:rPr>
+        <w:t>Video</w:t>
+      </w:r>
+      <w:r>
+        <w:rPr>
+          <w:b w:val="0"/>
+        </w:rPr>
+        <w:t xml:space="preserve"> </w:t>
+      </w:r>
+      <w:r>
+        <w:rPr>
+          <w:b w:val="0"/>
+        </w:rPr>
+        <w:t>Video</w:t>
       </w:r>
       <w:r>
         <w:rPr>
@@ -4597,13 +4794,25 @@
         <w:rPr>
           <w:b w:val="0"/>
         </w:rPr>
-        <w:t>Nexys Video</w:t>
-      </w:r>
-      <w:r>
-        <w:rPr>
-          <w:b w:val="0"/>
-        </w:rPr>
-        <w:t xml:space="preserve"> Video</w:t>
+        <w:t xml:space="preserve">Nexys </w:t>
+      </w:r>
+      <w:r>
+        <w:rPr>
+          <w:b w:val="0"/>
+        </w:rPr>
+        <w:t>Video</w:t>
+      </w:r>
+      <w:r>
+        <w:rPr>
+          <w:b w:val="0"/>
+        </w:rPr>
+        <w:t xml:space="preserve"> </w:t>
+      </w:r>
+      <w:r>
+        <w:rPr>
+          <w:b w:val="0"/>
+        </w:rPr>
+        <w:t>Video</w:t>
       </w:r>
       <w:r>
         <w:rPr>
@@ -4691,13 +4900,25 @@
         <w:rPr>
           <w:b w:val="0"/>
         </w:rPr>
-        <w:t>Nexys Video</w:t>
-      </w:r>
-      <w:r>
-        <w:rPr>
-          <w:b w:val="0"/>
-        </w:rPr>
-        <w:t xml:space="preserve"> Video</w:t>
+        <w:t xml:space="preserve">Nexys </w:t>
+      </w:r>
+      <w:r>
+        <w:rPr>
+          <w:b w:val="0"/>
+        </w:rPr>
+        <w:t>Video</w:t>
+      </w:r>
+      <w:r>
+        <w:rPr>
+          <w:b w:val="0"/>
+        </w:rPr>
+        <w:t xml:space="preserve"> </w:t>
+      </w:r>
+      <w:r>
+        <w:rPr>
+          <w:b w:val="0"/>
+        </w:rPr>
+        <w:t>Video</w:t>
       </w:r>
       <w:r>
         <w:rPr>
@@ -4755,13 +4976,25 @@
         <w:rPr>
           <w:b w:val="0"/>
         </w:rPr>
-        <w:t>Nexys Video</w:t>
-      </w:r>
-      <w:r>
-        <w:rPr>
-          <w:b w:val="0"/>
-        </w:rPr>
-        <w:t xml:space="preserve"> Video</w:t>
+        <w:t xml:space="preserve">Nexys </w:t>
+      </w:r>
+      <w:r>
+        <w:rPr>
+          <w:b w:val="0"/>
+        </w:rPr>
+        <w:t>Video</w:t>
+      </w:r>
+      <w:r>
+        <w:rPr>
+          <w:b w:val="0"/>
+        </w:rPr>
+        <w:t xml:space="preserve"> </w:t>
+      </w:r>
+      <w:r>
+        <w:rPr>
+          <w:b w:val="0"/>
+        </w:rPr>
+        <w:t>Video</w:t>
       </w:r>
       <w:r>
         <w:rPr>
@@ -4809,10 +5042,10 @@
             <v:path o:extrusionok="f" gradientshapeok="t" o:connecttype="rect"/>
             <o:lock v:ext="edit" aspectratio="t"/>
           </v:shapetype>
-          <v:shape id="_x0000_i1025" type="#_x0000_t75" alt="" style="width:422.45pt;height:244.25pt;mso-width-percent:0;mso-height-percent:0;mso-width-percent:0;mso-height-percent:0" o:ole="">
+          <v:shape id="_x0000_i1025" type="#_x0000_t75" alt="" style="width:422.2pt;height:244.1pt;mso-width-percent:0;mso-height-percent:0;mso-width-percent:0;mso-height-percent:0" o:ole="">
             <v:imagedata r:id="rId17" o:title=""/>
           </v:shape>
-          <o:OLEObject Type="Embed" ProgID="Visio.Drawing.15" ShapeID="_x0000_i1025" DrawAspect="Content" ObjectID="_1821806306" r:id="rId18"/>
+          <o:OLEObject Type="Embed" ProgID="Visio.Drawing.15" ShapeID="_x0000_i1025" DrawAspect="Content" ObjectID="_1821815020" r:id="rId18"/>
         </w:object>
       </w:r>
     </w:p>
@@ -4853,10 +5086,16 @@
         <w:t xml:space="preserve">. Digilent’s </w:t>
       </w:r>
       <w:r>
-        <w:t>Nexys Video</w:t>
-      </w:r>
-      <w:r>
-        <w:t xml:space="preserve"> Video</w:t>
+        <w:t xml:space="preserve">Nexys </w:t>
+      </w:r>
+      <w:r>
+        <w:t>Video</w:t>
+      </w:r>
+      <w:r>
+        <w:t xml:space="preserve"> </w:t>
+      </w:r>
+      <w:r>
+        <w:t>Video</w:t>
       </w:r>
       <w:r>
         <w:t xml:space="preserve"> FPGA board</w:t>
@@ -5367,19 +5606,31 @@
         <w:t>RVfpgaEL2-</w:t>
       </w:r>
       <w:r>
-        <w:t>Nexys Video</w:t>
-      </w:r>
-      <w:r>
-        <w:t xml:space="preserve"> Video</w:t>
+        <w:t xml:space="preserve">Nexys </w:t>
+      </w:r>
+      <w:r>
+        <w:t>Video</w:t>
+      </w:r>
+      <w:r>
+        <w:t xml:space="preserve"> </w:t>
+      </w:r>
+      <w:r>
+        <w:t>Video</w:t>
       </w:r>
       <w:r>
         <w:t xml:space="preserve"> onto the </w:t>
       </w:r>
       <w:r>
-        <w:t>Nexys Video</w:t>
-      </w:r>
-      <w:r>
-        <w:t xml:space="preserve"> Video</w:t>
+        <w:t xml:space="preserve">Nexys </w:t>
+      </w:r>
+      <w:r>
+        <w:t>Video</w:t>
+      </w:r>
+      <w:r>
+        <w:t xml:space="preserve"> </w:t>
+      </w:r>
+      <w:r>
+        <w:t>Video</w:t>
       </w:r>
       <w:r>
         <w:t xml:space="preserve"> Board and compile, download, and run a C program </w:t>
@@ -5394,10 +5645,16 @@
         <w:t>RVfpgaEL2-</w:t>
       </w:r>
       <w:r>
-        <w:t>Nexys Video</w:t>
-      </w:r>
-      <w:r>
-        <w:t xml:space="preserve"> Video</w:t>
+        <w:t xml:space="preserve">Nexys </w:t>
+      </w:r>
+      <w:r>
+        <w:t>Video</w:t>
+      </w:r>
+      <w:r>
+        <w:t xml:space="preserve"> </w:t>
+      </w:r>
+      <w:r>
+        <w:t>Video</w:t>
       </w:r>
     </w:p>
     <w:p>
@@ -5446,13 +5703,25 @@
         <w:rPr>
           <w:b w:val="0"/>
         </w:rPr>
-        <w:t>Nexys Video</w:t>
-      </w:r>
-      <w:r>
-        <w:rPr>
-          <w:b w:val="0"/>
-        </w:rPr>
-        <w:t xml:space="preserve"> Video</w:t>
+        <w:t xml:space="preserve">Nexys </w:t>
+      </w:r>
+      <w:r>
+        <w:rPr>
+          <w:b w:val="0"/>
+        </w:rPr>
+        <w:t>Video</w:t>
+      </w:r>
+      <w:r>
+        <w:rPr>
+          <w:b w:val="0"/>
+        </w:rPr>
+        <w:t xml:space="preserve"> </w:t>
+      </w:r>
+      <w:r>
+        <w:rPr>
+          <w:b w:val="0"/>
+        </w:rPr>
+        <w:t>Video</w:t>
       </w:r>
       <w:r>
         <w:rPr>
@@ -5613,7 +5882,17 @@
           <w:color w:val="000000" w:themeColor="text1"/>
           <w:szCs w:val="22"/>
         </w:rPr>
-        <w:t>Nexys Video</w:t>
+        <w:t xml:space="preserve">Nexys </w:t>
+      </w:r>
+      <w:r>
+        <w:rPr>
+          <w:rFonts w:eastAsia="Arial" w:cs="Arial"/>
+          <w:b w:val="0"/>
+          <w:iCs w:val="0"/>
+          <w:color w:val="000000" w:themeColor="text1"/>
+          <w:szCs w:val="22"/>
+        </w:rPr>
+        <w:t>Video</w:t>
       </w:r>
       <w:r>
         <w:rPr>
@@ -5765,13 +6044,25 @@
         <w:rPr>
           <w:b w:val="0"/>
         </w:rPr>
-        <w:t>Nexys Video</w:t>
-      </w:r>
-      <w:r>
-        <w:rPr>
-          <w:b w:val="0"/>
-        </w:rPr>
-        <w:t xml:space="preserve"> Video</w:t>
+        <w:t xml:space="preserve">Nexys </w:t>
+      </w:r>
+      <w:r>
+        <w:rPr>
+          <w:b w:val="0"/>
+        </w:rPr>
+        <w:t>Video</w:t>
+      </w:r>
+      <w:r>
+        <w:rPr>
+          <w:b w:val="0"/>
+        </w:rPr>
+        <w:t xml:space="preserve"> </w:t>
+      </w:r>
+      <w:r>
+        <w:rPr>
+          <w:b w:val="0"/>
+        </w:rPr>
+        <w:t>Video</w:t>
       </w:r>
       <w:r>
         <w:rPr>
@@ -6155,7 +6446,7 @@
           <w:i/>
           <w:iCs/>
         </w:rPr>
-        <w:t>Nexys Video</w:t>
+        <w:t xml:space="preserve">Nexys </w:t>
       </w:r>
       <w:r>
         <w:rPr>
@@ -6163,7 +6454,15 @@
           <w:i/>
           <w:iCs/>
         </w:rPr>
-        <w:t>VideoNoDDRPath</w:t>
+        <w:t>Video</w:t>
+      </w:r>
+      <w:r>
+        <w:rPr>
+          <w:rFonts w:eastAsia="Arial" w:cs="Arial"/>
+          <w:i/>
+          <w:iCs/>
+        </w:rPr>
+        <w:t>NoDDRPath</w:t>
       </w:r>
       <w:r>
         <w:rPr>
@@ -6210,7 +6509,7 @@
           <w:i/>
           <w:iCs/>
         </w:rPr>
-        <w:t>Nexys Video</w:t>
+        <w:t xml:space="preserve">Nexys </w:t>
       </w:r>
       <w:r>
         <w:rPr>
@@ -6218,7 +6517,15 @@
           <w:i/>
           <w:iCs/>
         </w:rPr>
-        <w:t>VideoNoDDRPath</w:t>
+        <w:t>Video</w:t>
+      </w:r>
+      <w:r>
+        <w:rPr>
+          <w:rFonts w:eastAsia="Arial" w:cs="Arial"/>
+          <w:i/>
+          <w:iCs/>
+        </w:rPr>
+        <w:t>NoDDRPath</w:t>
       </w:r>
       <w:r>
         <w:rPr>
@@ -6426,13 +6733,25 @@
         <w:rPr>
           <w:b w:val="0"/>
         </w:rPr>
-        <w:t>Nexys Video</w:t>
-      </w:r>
-      <w:r>
-        <w:rPr>
-          <w:b w:val="0"/>
-        </w:rPr>
-        <w:t xml:space="preserve"> Video</w:t>
+        <w:t xml:space="preserve">Nexys </w:t>
+      </w:r>
+      <w:r>
+        <w:rPr>
+          <w:b w:val="0"/>
+        </w:rPr>
+        <w:t>Video</w:t>
+      </w:r>
+      <w:r>
+        <w:rPr>
+          <w:b w:val="0"/>
+        </w:rPr>
+        <w:t xml:space="preserve"> </w:t>
+      </w:r>
+      <w:r>
+        <w:rPr>
+          <w:b w:val="0"/>
+        </w:rPr>
+        <w:t>Video</w:t>
       </w:r>
       <w:r>
         <w:rPr>
@@ -6462,13 +6781,25 @@
         <w:rPr>
           <w:b w:val="0"/>
         </w:rPr>
-        <w:t>Nexys Video</w:t>
-      </w:r>
-      <w:r>
-        <w:rPr>
-          <w:b w:val="0"/>
-        </w:rPr>
-        <w:t xml:space="preserve"> Video</w:t>
+        <w:t xml:space="preserve">Nexys </w:t>
+      </w:r>
+      <w:r>
+        <w:rPr>
+          <w:b w:val="0"/>
+        </w:rPr>
+        <w:t>Video</w:t>
+      </w:r>
+      <w:r>
+        <w:rPr>
+          <w:b w:val="0"/>
+        </w:rPr>
+        <w:t xml:space="preserve"> </w:t>
+      </w:r>
+      <w:r>
+        <w:rPr>
+          <w:b w:val="0"/>
+        </w:rPr>
+        <w:t>Video</w:t>
       </w:r>
       <w:r>
         <w:rPr>
@@ -6492,13 +6823,25 @@
         <w:rPr>
           <w:b w:val="0"/>
         </w:rPr>
-        <w:t>Nexys Video</w:t>
-      </w:r>
-      <w:r>
-        <w:rPr>
-          <w:b w:val="0"/>
-        </w:rPr>
-        <w:t xml:space="preserve"> Video</w:t>
+        <w:t xml:space="preserve">Nexys </w:t>
+      </w:r>
+      <w:r>
+        <w:rPr>
+          <w:b w:val="0"/>
+        </w:rPr>
+        <w:t>Video</w:t>
+      </w:r>
+      <w:r>
+        <w:rPr>
+          <w:b w:val="0"/>
+        </w:rPr>
+        <w:t xml:space="preserve"> </w:t>
+      </w:r>
+      <w:r>
+        <w:rPr>
+          <w:b w:val="0"/>
+        </w:rPr>
+        <w:t>Video</w:t>
       </w:r>
       <w:r>
         <w:rPr>
@@ -6516,13 +6859,25 @@
         <w:rPr>
           <w:b w:val="0"/>
         </w:rPr>
-        <w:t>Nexys Video</w:t>
-      </w:r>
-      <w:r>
-        <w:rPr>
-          <w:b w:val="0"/>
-        </w:rPr>
-        <w:t xml:space="preserve"> Video</w:t>
+        <w:t xml:space="preserve">Nexys </w:t>
+      </w:r>
+      <w:r>
+        <w:rPr>
+          <w:b w:val="0"/>
+        </w:rPr>
+        <w:t>Video</w:t>
+      </w:r>
+      <w:r>
+        <w:rPr>
+          <w:b w:val="0"/>
+        </w:rPr>
+        <w:t xml:space="preserve"> </w:t>
+      </w:r>
+      <w:r>
+        <w:rPr>
+          <w:b w:val="0"/>
+        </w:rPr>
+        <w:t>Video</w:t>
       </w:r>
       <w:r>
         <w:rPr>

</xml_diff>